<commit_message>
update on 2025-10-31 14:28:03.390748
</commit_message>
<xml_diff>
--- a/py Qt5窗口.docx
+++ b/py Qt5窗口.docx
@@ -17,7 +17,6 @@
         </w:rPr>
       </w:pPr>
       <w:bookmarkStart w:id="0" w:name="_Toc14769"/>
-      <w:bookmarkStart w:id="37" w:name="_GoBack"/>
     </w:p>
     <w:p>
       <w:pPr>
@@ -1936,7 +1935,7 @@
         </w:tc>
         <w:tc>
           <w:tcPr>
-            <w:tcW w:w="0" w:type="auto"/>
+            <w:tcW w:w="1134" w:type="dxa"/>
             <w:vAlign w:val="center"/>
           </w:tcPr>
           <w:p>
@@ -1971,7 +1970,7 @@
         </w:tc>
         <w:tc>
           <w:tcPr>
-            <w:tcW w:w="0" w:type="auto"/>
+            <w:tcW w:w="2108" w:type="dxa"/>
             <w:vAlign w:val="center"/>
           </w:tcPr>
           <w:p>
@@ -2015,7 +2014,8 @@
         </w:tblPrEx>
         <w:tc>
           <w:tcPr>
-            <w:tcW w:w="0" w:type="auto"/>
+            <w:tcW w:w="1113" w:type="dxa"/>
+            <w:vMerge w:val="restart"/>
             <w:vAlign w:val="center"/>
           </w:tcPr>
           <w:p>
@@ -2028,6 +2028,7 @@
                 <w:szCs w:val="24"/>
               </w:rPr>
             </w:pPr>
+            <w:bookmarkStart w:id="37" w:name="_GoBack" w:colFirst="0" w:colLast="0"/>
             <w:r>
               <w:rPr>
                 <w:rFonts w:hint="eastAsia" w:cs="华文中宋"/>
@@ -2046,7 +2047,7 @@
         </w:tc>
         <w:tc>
           <w:tcPr>
-            <w:tcW w:w="0" w:type="auto"/>
+            <w:tcW w:w="1134" w:type="dxa"/>
             <w:vAlign w:val="center"/>
           </w:tcPr>
           <w:p>
@@ -2086,7 +2087,7 @@
         </w:tc>
         <w:tc>
           <w:tcPr>
-            <w:tcW w:w="0" w:type="auto"/>
+            <w:tcW w:w="2108" w:type="dxa"/>
             <w:vAlign w:val="center"/>
           </w:tcPr>
           <w:p>
@@ -2135,6 +2136,105 @@
                 <w:szCs w:val="24"/>
               </w:rPr>
               <w:t>计时</w:t>
+            </w:r>
+          </w:p>
+        </w:tc>
+      </w:tr>
+      <w:bookmarkEnd w:id="37"/>
+      <w:tr>
+        <w:tblPrEx>
+          <w:tblBorders>
+            <w:top w:val="single" w:color="auto" w:sz="4" w:space="0"/>
+            <w:left w:val="single" w:color="auto" w:sz="4" w:space="0"/>
+            <w:bottom w:val="single" w:color="auto" w:sz="4" w:space="0"/>
+            <w:right w:val="single" w:color="auto" w:sz="4" w:space="0"/>
+            <w:insideH w:val="single" w:color="auto" w:sz="4" w:space="0"/>
+            <w:insideV w:val="single" w:color="auto" w:sz="4" w:space="0"/>
+          </w:tblBorders>
+          <w:tblCellMar>
+            <w:top w:w="0" w:type="dxa"/>
+            <w:left w:w="108" w:type="dxa"/>
+            <w:bottom w:w="0" w:type="dxa"/>
+            <w:right w:w="108" w:type="dxa"/>
+          </w:tblCellMar>
+        </w:tblPrEx>
+        <w:tc>
+          <w:tcPr>
+            <w:tcW w:w="1113" w:type="dxa"/>
+            <w:vMerge w:val="continue"/>
+            <w:tcBorders/>
+            <w:vAlign w:val="center"/>
+          </w:tcPr>
+          <w:p>
+            <w:pPr>
+              <w:jc w:val="left"/>
+              <w:rPr>
+                <w:rFonts w:hint="eastAsia" w:cs="华文中宋"/>
+                <w:bCs/>
+                <w:color w:val="ED7D31" w:themeColor="accent2"/>
+                <w:spacing w:val="7"/>
+                <w14:textFill>
+                  <w14:solidFill>
+                    <w14:schemeClr w14:val="accent2"/>
+                  </w14:solidFill>
+                </w14:textFill>
+              </w:rPr>
+            </w:pPr>
+          </w:p>
+        </w:tc>
+        <w:tc>
+          <w:tcPr>
+            <w:tcW w:w="1134" w:type="dxa"/>
+            <w:vAlign w:val="center"/>
+          </w:tcPr>
+          <w:p>
+            <w:pPr>
+              <w:jc w:val="left"/>
+              <w:rPr>
+                <w:rFonts w:hint="default" w:eastAsia="华文中宋" w:cs="华文中宋"/>
+                <w:bCs/>
+                <w:color w:val="FF0000"/>
+                <w:szCs w:val="24"/>
+                <w:lang w:val="en-US" w:eastAsia="zh-CN"/>
+              </w:rPr>
+            </w:pPr>
+            <w:r>
+              <w:rPr>
+                <w:rFonts w:hint="eastAsia" w:cs="华文中宋"/>
+                <w:bCs/>
+                <w:color w:val="FF0000"/>
+                <w:szCs w:val="24"/>
+                <w:lang w:val="en-US" w:eastAsia="zh-CN"/>
+              </w:rPr>
+              <w:t>stop()</w:t>
+            </w:r>
+          </w:p>
+        </w:tc>
+        <w:tc>
+          <w:tcPr>
+            <w:tcW w:w="2108" w:type="dxa"/>
+            <w:vAlign w:val="center"/>
+          </w:tcPr>
+          <w:p>
+            <w:pPr>
+              <w:jc w:val="left"/>
+              <w:rPr>
+                <w:rFonts w:hint="eastAsia" w:eastAsia="华文中宋" w:cs="华文中宋"/>
+                <w:bCs/>
+                <w:color w:val="EA82F1"/>
+                <w:szCs w:val="24"/>
+                <w:lang w:val="en-US" w:eastAsia="zh-CN"/>
+              </w:rPr>
+            </w:pPr>
+            <w:r>
+              <w:rPr>
+                <w:rFonts w:hint="eastAsia" w:cs="华文中宋"/>
+                <w:bCs/>
+                <w:color w:val="EA82F1"/>
+                <w:szCs w:val="24"/>
+                <w:lang w:val="en-US" w:eastAsia="zh-CN"/>
+              </w:rPr>
+              <w:t>结束</w:t>
             </w:r>
           </w:p>
         </w:tc>
@@ -2219,6 +2319,12 @@
             <w:insideH w:val="single" w:color="auto" w:sz="4" w:space="0"/>
             <w:insideV w:val="single" w:color="auto" w:sz="4" w:space="0"/>
           </w:tblBorders>
+          <w:tblCellMar>
+            <w:top w:w="0" w:type="dxa"/>
+            <w:left w:w="108" w:type="dxa"/>
+            <w:bottom w:w="0" w:type="dxa"/>
+            <w:right w:w="108" w:type="dxa"/>
+          </w:tblCellMar>
         </w:tblPrEx>
         <w:tc>
           <w:tcPr>
@@ -2700,9 +2806,8 @@
       <w:tblGrid>
         <w:gridCol w:w="1113"/>
         <w:gridCol w:w="3540"/>
-        <w:gridCol w:w="1688"/>
-        <w:gridCol w:w="1688"/>
-        <w:gridCol w:w="1478"/>
+        <w:gridCol w:w="2078"/>
+        <w:gridCol w:w="2623"/>
       </w:tblGrid>
       <w:tr>
         <w:tblPrEx>
@@ -2789,7 +2894,7 @@
         <w:tc>
           <w:tcPr>
             <w:tcW w:w="0" w:type="auto"/>
-            <w:gridSpan w:val="3"/>
+            <w:gridSpan w:val="2"/>
             <w:vAlign w:val="center"/>
           </w:tcPr>
           <w:p>
@@ -2886,7 +2991,7 @@
         <w:tc>
           <w:tcPr>
             <w:tcW w:w="0" w:type="auto"/>
-            <w:gridSpan w:val="3"/>
+            <w:gridSpan w:val="2"/>
             <w:vAlign w:val="center"/>
           </w:tcPr>
           <w:p>
@@ -2980,7 +3085,7 @@
         <w:tc>
           <w:tcPr>
             <w:tcW w:w="0" w:type="auto"/>
-            <w:gridSpan w:val="3"/>
+            <w:gridSpan w:val="2"/>
             <w:vAlign w:val="center"/>
           </w:tcPr>
           <w:p>
@@ -3077,7 +3182,7 @@
         <w:tc>
           <w:tcPr>
             <w:tcW w:w="0" w:type="auto"/>
-            <w:gridSpan w:val="3"/>
+            <w:gridSpan w:val="2"/>
             <w:vAlign w:val="center"/>
           </w:tcPr>
           <w:p>
@@ -3174,7 +3279,7 @@
         <w:tc>
           <w:tcPr>
             <w:tcW w:w="0" w:type="auto"/>
-            <w:gridSpan w:val="3"/>
+            <w:gridSpan w:val="2"/>
             <w:vAlign w:val="center"/>
           </w:tcPr>
           <w:p>
@@ -3287,7 +3392,7 @@
         <w:tc>
           <w:tcPr>
             <w:tcW w:w="0" w:type="auto"/>
-            <w:gridSpan w:val="3"/>
+            <w:gridSpan w:val="2"/>
             <w:vAlign w:val="center"/>
           </w:tcPr>
           <w:p>
@@ -3403,7 +3508,7 @@
         <w:tc>
           <w:tcPr>
             <w:tcW w:w="0" w:type="auto"/>
-            <w:gridSpan w:val="3"/>
+            <w:gridSpan w:val="2"/>
             <w:vAlign w:val="center"/>
           </w:tcPr>
           <w:p>
@@ -3519,7 +3624,7 @@
         <w:tc>
           <w:tcPr>
             <w:tcW w:w="0" w:type="auto"/>
-            <w:gridSpan w:val="3"/>
+            <w:gridSpan w:val="2"/>
             <w:vAlign w:val="center"/>
           </w:tcPr>
           <w:p>
@@ -3667,7 +3772,7 @@
         <w:tc>
           <w:tcPr>
             <w:tcW w:w="0" w:type="auto"/>
-            <w:gridSpan w:val="3"/>
+            <w:gridSpan w:val="2"/>
             <w:vAlign w:val="center"/>
           </w:tcPr>
           <w:p>
@@ -3775,7 +3880,7 @@
         <w:tc>
           <w:tcPr>
             <w:tcW w:w="0" w:type="auto"/>
-            <w:gridSpan w:val="3"/>
+            <w:gridSpan w:val="2"/>
             <w:vAlign w:val="center"/>
           </w:tcPr>
           <w:p>
@@ -3902,7 +4007,7 @@
         <w:tc>
           <w:tcPr>
             <w:tcW w:w="0" w:type="auto"/>
-            <w:gridSpan w:val="3"/>
+            <w:gridSpan w:val="2"/>
             <w:vAlign w:val="center"/>
           </w:tcPr>
           <w:p>
@@ -4144,66 +4249,6 @@
             </w:r>
           </w:p>
         </w:tc>
-        <w:tc>
-          <w:tcPr>
-            <w:tcW w:w="0" w:type="auto"/>
-            <w:vMerge w:val="restart"/>
-            <w:vAlign w:val="center"/>
-          </w:tcPr>
-          <w:p>
-            <w:pPr>
-              <w:jc w:val="left"/>
-              <w:rPr>
-                <w:rFonts w:cs="华文中宋"/>
-                <w:bCs/>
-                <w:color w:val="ED7D31" w:themeColor="accent2"/>
-                <w:szCs w:val="24"/>
-                <w14:textFill>
-                  <w14:solidFill>
-                    <w14:schemeClr w14:val="accent2"/>
-                  </w14:solidFill>
-                </w14:textFill>
-              </w:rPr>
-            </w:pPr>
-            <w:r>
-              <w:rPr>
-                <w:rFonts w:hint="eastAsia" w:cs="华文中宋"/>
-                <w:bCs/>
-                <w:color w:val="ED7D31" w:themeColor="accent2"/>
-                <w:szCs w:val="24"/>
-                <w14:textFill>
-                  <w14:solidFill>
-                    <w14:schemeClr w14:val="accent2"/>
-                  </w14:solidFill>
-                </w14:textFill>
-              </w:rPr>
-              <w:t>激活</w:t>
-            </w:r>
-            <w:r>
-              <w:rPr>
-                <w:rFonts w:hint="eastAsia" w:cs="华文中宋"/>
-                <w:bCs/>
-                <w:color w:val="EA82F1"/>
-                <w:szCs w:val="24"/>
-              </w:rPr>
-              <w:t>关闭</w:t>
-            </w:r>
-            <w:r>
-              <w:rPr>
-                <w:rFonts w:hint="eastAsia" w:cs="华文中宋"/>
-                <w:bCs/>
-                <w:color w:val="ED7D31" w:themeColor="accent2"/>
-                <w:szCs w:val="24"/>
-                <w14:textFill>
-                  <w14:solidFill>
-                    <w14:schemeClr w14:val="accent2"/>
-                  </w14:solidFill>
-                </w14:textFill>
-              </w:rPr>
-              <w:t>按钮</w:t>
-            </w:r>
-          </w:p>
-        </w:tc>
       </w:tr>
       <w:tr>
         <w:tblPrEx>
@@ -4389,29 +4434,6 @@
             </w:r>
           </w:p>
         </w:tc>
-        <w:tc>
-          <w:tcPr>
-            <w:tcW w:w="0" w:type="auto"/>
-            <w:vMerge w:val="continue"/>
-            <w:vAlign w:val="center"/>
-          </w:tcPr>
-          <w:p>
-            <w:pPr>
-              <w:jc w:val="left"/>
-              <w:rPr>
-                <w:rFonts w:cs="华文中宋"/>
-                <w:bCs/>
-                <w:color w:val="ED7D31" w:themeColor="accent2"/>
-                <w:szCs w:val="24"/>
-                <w14:textFill>
-                  <w14:solidFill>
-                    <w14:schemeClr w14:val="accent2"/>
-                  </w14:solidFill>
-                </w14:textFill>
-              </w:rPr>
-            </w:pPr>
-          </w:p>
-        </w:tc>
       </w:tr>
       <w:tr>
         <w:tblPrEx>
@@ -4597,29 +4619,6 @@
             </w:r>
           </w:p>
         </w:tc>
-        <w:tc>
-          <w:tcPr>
-            <w:tcW w:w="0" w:type="auto"/>
-            <w:vMerge w:val="continue"/>
-            <w:vAlign w:val="center"/>
-          </w:tcPr>
-          <w:p>
-            <w:pPr>
-              <w:jc w:val="left"/>
-              <w:rPr>
-                <w:rFonts w:cs="华文中宋"/>
-                <w:bCs/>
-                <w:color w:val="ED7D31" w:themeColor="accent2"/>
-                <w:szCs w:val="24"/>
-                <w14:textFill>
-                  <w14:solidFill>
-                    <w14:schemeClr w14:val="accent2"/>
-                  </w14:solidFill>
-                </w14:textFill>
-              </w:rPr>
-            </w:pPr>
-          </w:p>
-        </w:tc>
       </w:tr>
       <w:tr>
         <w:tblPrEx>
@@ -4750,7 +4749,6 @@
         <w:tc>
           <w:tcPr>
             <w:tcW w:w="0" w:type="auto"/>
-            <w:gridSpan w:val="2"/>
             <w:vAlign w:val="center"/>
           </w:tcPr>
           <w:p>
@@ -4863,7 +4861,6 @@
         <w:tc>
           <w:tcPr>
             <w:tcW w:w="0" w:type="auto"/>
-            <w:gridSpan w:val="2"/>
             <w:vAlign w:val="center"/>
           </w:tcPr>
           <w:p>
@@ -4999,7 +4996,6 @@
         <w:tc>
           <w:tcPr>
             <w:tcW w:w="0" w:type="auto"/>
-            <w:gridSpan w:val="2"/>
             <w:vAlign w:val="center"/>
           </w:tcPr>
           <w:p>
@@ -5135,7 +5131,6 @@
         <w:tc>
           <w:tcPr>
             <w:tcW w:w="0" w:type="auto"/>
-            <w:gridSpan w:val="2"/>
             <w:vAlign w:val="center"/>
           </w:tcPr>
           <w:p>
@@ -5279,7 +5274,7 @@
         <w:tc>
           <w:tcPr>
             <w:tcW w:w="0" w:type="auto"/>
-            <w:gridSpan w:val="3"/>
+            <w:gridSpan w:val="2"/>
             <w:vAlign w:val="center"/>
           </w:tcPr>
           <w:p>
@@ -5385,7 +5380,7 @@
         <w:tc>
           <w:tcPr>
             <w:tcW w:w="0" w:type="auto"/>
-            <w:gridSpan w:val="3"/>
+            <w:gridSpan w:val="2"/>
             <w:vAlign w:val="center"/>
           </w:tcPr>
           <w:p>
@@ -5521,7 +5516,7 @@
         <w:tc>
           <w:tcPr>
             <w:tcW w:w="0" w:type="auto"/>
-            <w:gridSpan w:val="3"/>
+            <w:gridSpan w:val="2"/>
             <w:vAlign w:val="center"/>
           </w:tcPr>
           <w:p>
@@ -5687,7 +5682,6 @@
         <w:tc>
           <w:tcPr>
             <w:tcW w:w="0" w:type="auto"/>
-            <w:gridSpan w:val="2"/>
             <w:vAlign w:val="center"/>
           </w:tcPr>
           <w:p>
@@ -5826,7 +5820,6 @@
         <w:tc>
           <w:tcPr>
             <w:tcW w:w="0" w:type="auto"/>
-            <w:gridSpan w:val="2"/>
             <w:vAlign w:val="center"/>
           </w:tcPr>
           <w:p>
@@ -5965,7 +5958,6 @@
         <w:tc>
           <w:tcPr>
             <w:tcW w:w="0" w:type="auto"/>
-            <w:gridSpan w:val="2"/>
             <w:vAlign w:val="center"/>
           </w:tcPr>
           <w:p>
@@ -6118,7 +6110,6 @@
         <w:tc>
           <w:tcPr>
             <w:tcW w:w="0" w:type="auto"/>
-            <w:gridSpan w:val="2"/>
             <w:vAlign w:val="center"/>
           </w:tcPr>
           <w:p>
@@ -6291,7 +6282,6 @@
         <w:tc>
           <w:tcPr>
             <w:tcW w:w="0" w:type="auto"/>
-            <w:gridSpan w:val="2"/>
             <w:vAlign w:val="center"/>
           </w:tcPr>
           <w:p>
@@ -6427,7 +6417,6 @@
         <w:tc>
           <w:tcPr>
             <w:tcW w:w="0" w:type="auto"/>
-            <w:gridSpan w:val="2"/>
             <w:vAlign w:val="center"/>
           </w:tcPr>
           <w:p>
@@ -6563,7 +6552,6 @@
         <w:tc>
           <w:tcPr>
             <w:tcW w:w="0" w:type="auto"/>
-            <w:gridSpan w:val="2"/>
             <w:vAlign w:val="center"/>
           </w:tcPr>
           <w:p>
@@ -6730,8 +6718,8 @@
         </w:tblCellMar>
       </w:tblPr>
       <w:tblGrid>
-        <w:gridCol w:w="1329"/>
-        <w:gridCol w:w="1338"/>
+        <w:gridCol w:w="5131"/>
+        <w:gridCol w:w="1562"/>
       </w:tblGrid>
       <w:tr>
         <w:tblPrEx>
@@ -6811,6 +6799,123 @@
                 </w14:textFill>
               </w:rPr>
               <w:t>实例化图标</w:t>
+            </w:r>
+          </w:p>
+        </w:tc>
+      </w:tr>
+      <w:tr>
+        <w:tblPrEx>
+          <w:tblBorders>
+            <w:top w:val="single" w:color="auto" w:sz="4" w:space="0"/>
+            <w:left w:val="single" w:color="auto" w:sz="4" w:space="0"/>
+            <w:bottom w:val="single" w:color="auto" w:sz="4" w:space="0"/>
+            <w:right w:val="single" w:color="auto" w:sz="4" w:space="0"/>
+            <w:insideH w:val="single" w:color="auto" w:sz="4" w:space="0"/>
+            <w:insideV w:val="single" w:color="auto" w:sz="4" w:space="0"/>
+          </w:tblBorders>
+          <w:tblCellMar>
+            <w:top w:w="0" w:type="dxa"/>
+            <w:left w:w="108" w:type="dxa"/>
+            <w:bottom w:w="0" w:type="dxa"/>
+            <w:right w:w="108" w:type="dxa"/>
+          </w:tblCellMar>
+        </w:tblPrEx>
+        <w:tc>
+          <w:tcPr>
+            <w:tcW w:w="0" w:type="auto"/>
+            <w:shd w:val="clear"/>
+            <w:vAlign w:val="center"/>
+          </w:tcPr>
+          <w:p>
+            <w:pPr>
+              <w:rPr>
+                <w:rFonts w:hint="eastAsia" w:ascii="华文中宋" w:hAnsi="华文中宋" w:eastAsia="华文中宋" w:cs="华文中宋"/>
+                <w:b/>
+                <w:bCs/>
+                <w:color w:val="FF0000"/>
+                <w:spacing w:val="7"/>
+                <w:kern w:val="2"/>
+                <w:sz w:val="21"/>
+                <w:szCs w:val="21"/>
+                <w:lang w:val="en-US" w:eastAsia="zh-CN" w:bidi="ar-SA"/>
+              </w:rPr>
+            </w:pPr>
+            <w:r>
+              <w:rPr>
+                <w:rFonts w:hint="eastAsia" w:cs="华文中宋"/>
+                <w:bCs/>
+                <w:color w:val="FF0000"/>
+                <w:spacing w:val="7"/>
+                <w:lang w:val="en-US" w:eastAsia="zh-CN"/>
+              </w:rPr>
+              <w:t>QShortCut(</w:t>
+            </w:r>
+            <w:r>
+              <w:rPr>
+                <w:rFonts w:hint="eastAsia" w:cs="华文中宋"/>
+                <w:bCs/>
+                <w:color w:val="ED7D31" w:themeColor="accent2"/>
+                <w:spacing w:val="7"/>
+                <w:lang w:val="en-US" w:eastAsia="zh-CN"/>
+                <w14:textFill>
+                  <w14:solidFill>
+                    <w14:schemeClr w14:val="accent2"/>
+                  </w14:solidFill>
+                </w14:textFill>
+              </w:rPr>
+              <w:t>QKeySequence</w:t>
+            </w:r>
+            <w:r>
+              <w:rPr>
+                <w:rFonts w:hint="eastAsia" w:cs="华文中宋"/>
+                <w:bCs/>
+                <w:color w:val="FF0000"/>
+                <w:spacing w:val="7"/>
+                <w:lang w:val="en-US" w:eastAsia="zh-CN"/>
+              </w:rPr>
+              <w:t>, widget, activated)</w:t>
+            </w:r>
+          </w:p>
+        </w:tc>
+        <w:tc>
+          <w:tcPr>
+            <w:tcW w:w="0" w:type="auto"/>
+            <w:shd w:val="clear"/>
+            <w:vAlign w:val="center"/>
+          </w:tcPr>
+          <w:p>
+            <w:pPr>
+              <w:rPr>
+                <w:rFonts w:hint="eastAsia" w:ascii="华文中宋" w:hAnsi="华文中宋" w:eastAsia="华文中宋" w:cs="华文中宋"/>
+                <w:b/>
+                <w:bCs/>
+                <w:color w:val="ED7D31" w:themeColor="accent2"/>
+                <w:spacing w:val="7"/>
+                <w:kern w:val="2"/>
+                <w:sz w:val="21"/>
+                <w:szCs w:val="21"/>
+                <w:lang w:val="en-US" w:eastAsia="zh-CN" w:bidi="ar-SA"/>
+                <w14:textFill>
+                  <w14:solidFill>
+                    <w14:schemeClr w14:val="accent2"/>
+                  </w14:solidFill>
+                </w14:textFill>
+              </w:rPr>
+            </w:pPr>
+            <w:r>
+              <w:rPr>
+                <w:rFonts w:hint="eastAsia" w:cs="华文中宋"/>
+                <w:bCs/>
+                <w:color w:val="ED7D31" w:themeColor="accent2"/>
+                <w:spacing w:val="7"/>
+                <w:lang w:val="en-US" w:eastAsia="zh-CN"/>
+                <w14:textFill>
+                  <w14:solidFill>
+                    <w14:schemeClr w14:val="accent2"/>
+                  </w14:solidFill>
+                </w14:textFill>
+              </w:rPr>
+              <w:t>实例化快捷键</w:t>
             </w:r>
           </w:p>
         </w:tc>
@@ -7688,16 +7793,6 @@
         </w:tc>
       </w:tr>
     </w:tbl>
-    <w:p>
-      <w:pPr>
-        <w:rPr>
-          <w:rFonts w:hint="eastAsia" w:cs="华文中宋"/>
-          <w:bCs/>
-          <w:color w:val="00B0F0"/>
-          <w:spacing w:val="7"/>
-        </w:rPr>
-      </w:pPr>
-    </w:p>
     <w:p>
       <w:pPr>
         <w:rPr>
@@ -9779,12 +9874,6 @@
             <w:insideH w:val="single" w:color="auto" w:sz="4" w:space="0"/>
             <w:insideV w:val="single" w:color="auto" w:sz="4" w:space="0"/>
           </w:tblBorders>
-          <w:tblCellMar>
-            <w:top w:w="0" w:type="dxa"/>
-            <w:left w:w="108" w:type="dxa"/>
-            <w:bottom w:w="0" w:type="dxa"/>
-            <w:right w:w="108" w:type="dxa"/>
-          </w:tblCellMar>
         </w:tblPrEx>
         <w:trPr>
           <w:trHeight w:val="310" w:hRule="atLeast"/>
@@ -10033,12 +10122,6 @@
             <w:insideH w:val="single" w:color="auto" w:sz="4" w:space="0"/>
             <w:insideV w:val="single" w:color="auto" w:sz="4" w:space="0"/>
           </w:tblBorders>
-          <w:tblCellMar>
-            <w:top w:w="0" w:type="dxa"/>
-            <w:left w:w="108" w:type="dxa"/>
-            <w:bottom w:w="0" w:type="dxa"/>
-            <w:right w:w="108" w:type="dxa"/>
-          </w:tblCellMar>
         </w:tblPrEx>
         <w:trPr>
           <w:trHeight w:val="311" w:hRule="atLeast"/>
@@ -12574,8 +12657,8 @@
           <w:spacing w:val="7"/>
         </w:rPr>
       </w:pPr>
-      <w:bookmarkStart w:id="19" w:name="_Toc2740"/>
-      <w:bookmarkStart w:id="20" w:name="_Toc12309"/>
+      <w:bookmarkStart w:id="19" w:name="_Toc12309"/>
+      <w:bookmarkStart w:id="20" w:name="_Toc2740"/>
       <w:r>
         <w:rPr>
           <w:rFonts w:hint="eastAsia" w:cs="华文中宋"/>
@@ -12625,12 +12708,6 @@
             <w:insideH w:val="single" w:color="auto" w:sz="4" w:space="0"/>
             <w:insideV w:val="single" w:color="auto" w:sz="4" w:space="0"/>
           </w:tblBorders>
-          <w:tblCellMar>
-            <w:top w:w="0" w:type="dxa"/>
-            <w:left w:w="108" w:type="dxa"/>
-            <w:bottom w:w="0" w:type="dxa"/>
-            <w:right w:w="108" w:type="dxa"/>
-          </w:tblCellMar>
         </w:tblPrEx>
         <w:tc>
           <w:tcPr>
@@ -13568,6 +13645,12 @@
             <w:insideH w:val="single" w:color="auto" w:sz="4" w:space="0"/>
             <w:insideV w:val="single" w:color="auto" w:sz="4" w:space="0"/>
           </w:tblBorders>
+          <w:tblCellMar>
+            <w:top w:w="0" w:type="dxa"/>
+            <w:left w:w="108" w:type="dxa"/>
+            <w:bottom w:w="0" w:type="dxa"/>
+            <w:right w:w="108" w:type="dxa"/>
+          </w:tblCellMar>
         </w:tblPrEx>
         <w:tc>
           <w:tcPr>
@@ -16772,6 +16855,12 @@
             <w:insideH w:val="single" w:color="auto" w:sz="4" w:space="0"/>
             <w:insideV w:val="single" w:color="auto" w:sz="4" w:space="0"/>
           </w:tblBorders>
+          <w:tblCellMar>
+            <w:top w:w="0" w:type="dxa"/>
+            <w:left w:w="108" w:type="dxa"/>
+            <w:bottom w:w="0" w:type="dxa"/>
+            <w:right w:w="108" w:type="dxa"/>
+          </w:tblCellMar>
         </w:tblPrEx>
         <w:tc>
           <w:tcPr>
@@ -17493,6 +17582,14 @@
       </w:tblGrid>
       <w:tr>
         <w:tblPrEx>
+          <w:tblBorders>
+            <w:top w:val="single" w:color="auto" w:sz="4" w:space="0"/>
+            <w:left w:val="single" w:color="auto" w:sz="4" w:space="0"/>
+            <w:bottom w:val="single" w:color="auto" w:sz="4" w:space="0"/>
+            <w:right w:val="single" w:color="auto" w:sz="4" w:space="0"/>
+            <w:insideH w:val="single" w:color="auto" w:sz="4" w:space="0"/>
+            <w:insideV w:val="single" w:color="auto" w:sz="4" w:space="0"/>
+          </w:tblBorders>
           <w:tblCellMar>
             <w:top w:w="0" w:type="dxa"/>
             <w:left w:w="108" w:type="dxa"/>
@@ -23396,7 +23493,6 @@
         </w:rPr>
       </w:pPr>
     </w:p>
-    <w:bookmarkEnd w:id="37"/>
     <w:sectPr>
       <w:pgSz w:w="11906" w:h="16838"/>
       <w:pgMar w:top="720" w:right="720" w:bottom="720" w:left="720" w:header="851" w:footer="992" w:gutter="0"/>

</xml_diff>